<commit_message>
docs(report): declare AI use for C1 and report sections 5-7
Approx. time spent (min) : 30
</commit_message>
<xml_diff>
--- a/docs/report/12264692_Midterm.docx
+++ b/docs/report/12264692_Midterm.docx
@@ -470,7 +470,7 @@
                 <w:b/>
                 <w:sz w:val="19"/>
               </w:rPr>
-              <w:t>Check (2026-10-17, branch feat/c1-map-ui)</w:t>
+              <w:t>Check (2026-10-17, run by Claude Code on my machine)</w:t>
             </w:r>
           </w:p>
         </w:tc>
@@ -684,7 +684,7 @@
         <w:t>Remaining issue:</w:t>
       </w:r>
       <w:r>
-        <w:t xml:space="preserve"> the map reloads only when the page opens and after the student's own action, so another student's check-in appears after a reload. Automatic refresh is my first task after the midterm. The UI also has no automated test yet; it is checked by hand.</w:t>
+        <w:t xml:space="preserve"> the map reloads only when the page opens and after the student's own action, so another student's check-in appears after a reload. Automatic refresh is my first task after the midterm. The UI also has no automated test yet; it is checked in the browser.</w:t>
       </w:r>
     </w:p>
     <w:p>
@@ -729,11 +729,15 @@
       </w:r>
     </w:p>
     <w:p>
-      <w:pPr>
-        <w:shd w:val="clear" w:color="auto" w:fill="FFF2CC"/>
-      </w:pPr>
+      <w:pPr/>
       <w:r>
-        <w:t>[Adam: AI use. State which tools you used for this work and how you checked their output, as the course and AI_USAGE.md require.]</w:t>
+        <w:rPr>
+          <w:b/>
+        </w:rPr>
+        <w:t>AI use.</w:t>
+      </w:r>
+      <w:r>
+        <w:t xml:space="preserve"> Claude Code (Anthropic) wrote the map UI code, ran the checks in the table above and drafted my report sections and this report (AI_USAGE.md entry 10). The UI decisions it followed (token kept in the browser, error messages shown as returned, map refreshed after each action) are the ones I set in my PR #8 review before any UI code existed. The checks were run by the AI on my machine and are recorded with screenshots; a re-run by a team member is still to do.</w:t>
       </w:r>
     </w:p>
     <w:p>

</xml_diff>

<commit_message>
docs(report): fit Adam's individual report on one page
Approx. time spent (min) : 30
</commit_message>
<xml_diff>
--- a/docs/report/12264692_Midterm.docx
+++ b/docs/report/12264692_Midterm.docx
@@ -242,11 +242,6 @@
     </w:tbl>
     <w:p>
       <w:pPr>
-        <w:spacing w:after="60"/>
-      </w:pPr>
-    </w:p>
-    <w:p>
-      <w:pPr>
         <w:pStyle w:val="Heading1"/>
       </w:pPr>
       <w:r>
@@ -255,7 +250,7 @@
     </w:p>
     <w:p>
       <w:r>
-        <w:t>I was responsible for reviewing the plan, the API contract and the backend, for the front-end (C1 Map UI and the S2 buttons), and for report sections 5 (front-end part), 6 and 7. Each item went through a pull request.</w:t>
+        <w:t>I owned the reviews of the plan, contract and backend, the front-end (C1 Map UI and the S2 buttons) and report sections 5 (front-end), 6 and 7. Each item went through a pull request.</w:t>
       </w:r>
     </w:p>
     <w:p>
@@ -269,17 +264,7 @@
         <w:t>Reviews</w:t>
       </w:r>
       <w:r>
-        <w:t xml:space="preserve"> (PR #5 to #8): approved the stack and rules R1 and R2, checked that I could build C1 from the API contract alone, re-ran the tests and the build on a fresh clone and reported a README gap (</w:t>
-      </w:r>
-      <w:r>
-        <w:rPr>
-          <w:rFonts w:ascii="Consolas" w:hAnsi="Consolas"/>
-          <w:sz w:val="19"/>
-        </w:rPr>
-        <w:t>tsc</w:t>
-      </w:r>
-      <w:r>
-        <w:t xml:space="preserve"> fails before the first build). Review of the team report draft (PR #25).</w:t>
+        <w:t xml:space="preserve"> (PR #5–#8, #25): approved the stack, R1 and R2; checked that C1 could be built from the contract alone; re-ran the tests and the build on a fresh clone.</w:t>
       </w:r>
     </w:p>
     <w:p>
@@ -303,17 +288,7 @@
         <w:t>app/page.tsx</w:t>
       </w:r>
       <w:r>
-        <w:t xml:space="preserve">, PR #26): the map from </w:t>
-      </w:r>
-      <w:r>
-        <w:rPr>
-          <w:rFonts w:ascii="Consolas" w:hAnsi="Consolas"/>
-          <w:sz w:val="19"/>
-        </w:rPr>
-        <w:t>GET /api/tables</w:t>
-      </w:r>
-      <w:r>
-        <w:t xml:space="preserve"> with a colour and a text label per table, the "No free table reported right now" message, and the "I'm sitting here" / "I'm leaving" buttons that keep the check-in token in the browser.</w:t>
+        <w:t>, PR #26): map with a colour and a text label per table, the "no free table" message, and the two buttons with the check-in token kept in the browser.</w:t>
       </w:r>
     </w:p>
     <w:p>
@@ -337,7 +312,7 @@
         <w:t>docs/evidence/2026-10-17_c1_ui_check.md</w:t>
       </w:r>
       <w:r>
-        <w:t>): five screenshots for S1-AC1, S1-AC2, S2-AC1, S2-AC2, R1 and the wrong-token case, and the D1 check.</w:t>
+        <w:t>): five screenshots and the D1 check.</w:t>
       </w:r>
     </w:p>
     <w:p>
@@ -351,7 +326,7 @@
         <w:t>Team report</w:t>
       </w:r>
       <w:r>
-        <w:t xml:space="preserve"> sections 5 (front-end), 6 Security and privacy, 7 Plan for the final demo, appendix A3.</w:t>
+        <w:t xml:space="preserve"> sections 5 (front-end), 6, 7 and appendix A3.</w:t>
       </w:r>
     </w:p>
     <w:p>
@@ -370,7 +345,7 @@
         <w:t>Choice.</w:t>
       </w:r>
       <w:r>
-        <w:t xml:space="preserve"> The map UI never decides an outcome itself. It shows the </w:t>
+        <w:t xml:space="preserve"> The map UI never decides an outcome. It shows the </w:t>
       </w:r>
       <w:r>
         <w:rPr>
@@ -380,7 +355,7 @@
         <w:t>error.message</w:t>
       </w:r>
       <w:r>
-        <w:t xml:space="preserve"> that the API returns for 403 and 409 unchanged, and "I'm leaving" always calls check-out, even when the browser has no token for that table.</w:t>
+        <w:t xml:space="preserve"> returned for 403 and 409 unchanged, and "I'm leaving" always calls check-out, even when the browser holds no token.</w:t>
       </w:r>
     </w:p>
     <w:p>
@@ -391,7 +366,7 @@
         <w:t>Alternatives.</w:t>
       </w:r>
       <w:r>
-        <w:t xml:space="preserve"> (a) The UI maps each error code to its own text. (b) The UI hides "I'm leaving" or greys out occupied tables when it holds no token, so it decides who may free a table.</w:t>
+        <w:t xml:space="preserve"> (a) The UI maps each error code to its own text. (b) The UI hides "I'm leaving" or greys out tables when it holds no token, so it decides who may free a table.</w:t>
       </w:r>
     </w:p>
     <w:p>
@@ -402,17 +377,7 @@
         <w:t>Why.</w:t>
       </w:r>
       <w:r>
-        <w:t xml:space="preserve"> Both alternatives copy rules that our decision D1 keeps in C2 (</w:t>
-      </w:r>
-      <w:r>
-        <w:rPr>
-          <w:rFonts w:ascii="Consolas" w:hAnsi="Consolas"/>
-          <w:sz w:val="19"/>
-        </w:rPr>
-        <w:t>lib/seatStatus.ts</w:t>
-      </w:r>
-      <w:r>
-        <w:t>). With (b), the UI would need to know about R1, R2 and the token check, and would be wrong as soon as one rule changes. Keeping C1 a pure display means a rule changes in one place (maintainability, Week 5). Cost: one request that the UI could have guessed would fail, and messages that are the same on every screen.</w:t>
+        <w:t xml:space="preserve"> Both copy rules that decision D1 keeps in C2. With (b) the UI would need R1, R2 and the token check and would break when a rule changes; a pure display keeps each rule in one place (maintainability, Week 5). Cost: one request that was bound to fail, and the same messages on every screen.</w:t>
       </w:r>
     </w:p>
     <w:p>
@@ -423,7 +388,7 @@
         <w:t>Link to the product.</w:t>
       </w:r>
       <w:r>
-        <w:t xml:space="preserve"> S2 stays consistent with S1: the map and the buttons always show what C2 decided, so a student never sees a table as free that the server considers occupied.</w:t>
+        <w:t xml:space="preserve"> The map and the buttons always show what C2 decided, so a student never sees as free a table the server holds as occupied.</w:t>
       </w:r>
     </w:p>
     <w:p>
@@ -458,7 +423,7 @@
         </w:trPr>
         <w:tc>
           <w:tcPr>
-            <w:tcW w:w="4400" w:type="dxa"/>
+            <w:tcW w:w="4819" w:type="dxa"/>
             <w:shd w:val="clear" w:color="auto" w:fill="D9E2F3"/>
           </w:tcPr>
           <w:p>
@@ -476,7 +441,7 @@
         </w:tc>
         <w:tc>
           <w:tcPr>
-            <w:tcW w:w="2600" w:type="dxa"/>
+            <w:tcW w:w="2381" w:type="dxa"/>
             <w:shd w:val="clear" w:color="auto" w:fill="D9E2F3"/>
           </w:tcPr>
           <w:p>
@@ -494,7 +459,7 @@
         </w:tc>
         <w:tc>
           <w:tcPr>
-            <w:tcW w:w="2893" w:type="dxa"/>
+            <w:tcW w:w="2721" w:type="dxa"/>
             <w:shd w:val="clear" w:color="auto" w:fill="D9E2F3"/>
           </w:tcPr>
           <w:p>
@@ -517,7 +482,7 @@
         </w:trPr>
         <w:tc>
           <w:tcPr>
-            <w:tcW w:w="4400" w:type="dxa"/>
+            <w:tcW w:w="4819" w:type="dxa"/>
           </w:tcPr>
           <w:p>
             <w:pPr>
@@ -527,13 +492,13 @@
               <w:rPr>
                 <w:sz w:val="19"/>
               </w:rPr>
-              <w:t>Browser check of the UI, production build, 5 steps</w:t>
+              <w:t>Browser check, 5 steps (S1, S2, R1, 403)</w:t>
             </w:r>
           </w:p>
         </w:tc>
         <w:tc>
           <w:tcPr>
-            <w:tcW w:w="2600" w:type="dxa"/>
+            <w:tcW w:w="2381" w:type="dxa"/>
           </w:tcPr>
           <w:p>
             <w:pPr>
@@ -543,13 +508,13 @@
               <w:rPr>
                 <w:sz w:val="19"/>
               </w:rPr>
-              <w:t>S1-AC1, S1-AC2, S2-AC1, S2-AC2, R1, 403 as specified</w:t>
+              <w:t>As specified</w:t>
             </w:r>
           </w:p>
         </w:tc>
         <w:tc>
           <w:tcPr>
-            <w:tcW w:w="2893" w:type="dxa"/>
+            <w:tcW w:w="2721" w:type="dxa"/>
           </w:tcPr>
           <w:p>
             <w:pPr>
@@ -559,7 +524,7 @@
               <w:rPr>
                 <w:sz w:val="19"/>
               </w:rPr>
-              <w:t>5/5, screenshots in team report A3</w:t>
+              <w:t>5/5, screenshots in A3</w:t>
             </w:r>
           </w:p>
         </w:tc>
@@ -570,7 +535,7 @@
         </w:trPr>
         <w:tc>
           <w:tcPr>
-            <w:tcW w:w="4400" w:type="dxa"/>
+            <w:tcW w:w="4819" w:type="dxa"/>
           </w:tcPr>
           <w:p>
             <w:pPr>
@@ -580,13 +545,13 @@
               <w:rPr>
                 <w:sz w:val="19"/>
               </w:rPr>
-              <w:t>D1 check: R2 set to 5 s in C2 only, no change to C1</w:t>
+              <w:t>D1: R2 at 5 s in C2 only, C1 unchanged</w:t>
             </w:r>
           </w:p>
         </w:tc>
         <w:tc>
           <w:tcPr>
-            <w:tcW w:w="2600" w:type="dxa"/>
+            <w:tcW w:w="2381" w:type="dxa"/>
           </w:tcPr>
           <w:p>
             <w:pPr>
@@ -596,13 +561,13 @@
               <w:rPr>
                 <w:sz w:val="19"/>
               </w:rPr>
-              <w:t>Table free again after 5 s</w:t>
+              <w:t>Free after 5 s</w:t>
             </w:r>
           </w:p>
         </w:tc>
         <w:tc>
           <w:tcPr>
-            <w:tcW w:w="2893" w:type="dxa"/>
+            <w:tcW w:w="2721" w:type="dxa"/>
           </w:tcPr>
           <w:p>
             <w:pPr>
@@ -623,7 +588,7 @@
         </w:trPr>
         <w:tc>
           <w:tcPr>
-            <w:tcW w:w="4400" w:type="dxa"/>
+            <w:tcW w:w="4819" w:type="dxa"/>
           </w:tcPr>
           <w:p>
             <w:pPr>
@@ -633,13 +598,13 @@
               <w:rPr>
                 <w:sz w:val="19"/>
               </w:rPr>
-              <w:t>npm test, npm run lint, npx tsc --noEmit, npm run build</w:t>
+              <w:t>Tests, lint, tsc, build</w:t>
             </w:r>
           </w:p>
         </w:tc>
         <w:tc>
           <w:tcPr>
-            <w:tcW w:w="2600" w:type="dxa"/>
+            <w:tcW w:w="2381" w:type="dxa"/>
           </w:tcPr>
           <w:p>
             <w:pPr>
@@ -655,7 +620,7 @@
         </w:tc>
         <w:tc>
           <w:tcPr>
-            <w:tcW w:w="2893" w:type="dxa"/>
+            <w:tcW w:w="2721" w:type="dxa"/>
           </w:tcPr>
           <w:p>
             <w:pPr>
@@ -665,17 +630,12 @@
               <w:rPr>
                 <w:sz w:val="19"/>
               </w:rPr>
-              <w:t>28/28 tests; lint, types, build OK</w:t>
+              <w:t>28/28; all OK</w:t>
             </w:r>
           </w:p>
         </w:tc>
       </w:tr>
     </w:tbl>
-    <w:p>
-      <w:pPr>
-        <w:spacing w:after="60"/>
-      </w:pPr>
-    </w:p>
     <w:p>
       <w:r>
         <w:rPr>
@@ -684,7 +644,7 @@
         <w:t>Remaining issue:</w:t>
       </w:r>
       <w:r>
-        <w:t xml:space="preserve"> the map reloads only when the page opens and after the student's own action, so another student's check-in appears after a reload. Automatic refresh is my first task after the midterm. The UI also has no automated test yet; it is checked in the browser.</w:t>
+        <w:t xml:space="preserve"> another student's check-in appears only after a reload (automatic refresh is my next task), and the UI has no automated test.</w:t>
       </w:r>
     </w:p>
     <w:p>
@@ -692,10 +652,10 @@
         <w:rPr>
           <w:b/>
         </w:rPr>
-        <w:t>What I read in the backend myself.</w:t>
+        <w:t>What I read myself.</w:t>
       </w:r>
       <w:r>
-        <w:t xml:space="preserve"> Both route handlers and </w:t>
+        <w:t xml:space="preserve"> The two routes and </w:t>
       </w:r>
       <w:r>
         <w:rPr>
@@ -715,17 +675,7 @@
         <w:t>checkOut</w:t>
       </w:r>
       <w:r>
-        <w:t xml:space="preserve"> in </w:t>
-      </w:r>
-      <w:r>
-        <w:rPr>
-          <w:rFonts w:ascii="Consolas" w:hAnsi="Consolas"/>
-          <w:sz w:val="19"/>
-        </w:rPr>
-        <w:t>lib/seatStatus.ts</w:t>
-      </w:r>
-      <w:r>
-        <w:t>: the order of checks (404, 400, 409, 403) matches the API contract, and the wrong-token test checks that the table stays occupied.</w:t>
+        <w:t>: the checks run in the contract's order (404, 400, 409, 403).</w:t>
       </w:r>
     </w:p>
     <w:p>
@@ -737,7 +687,7 @@
         <w:t>AI use.</w:t>
       </w:r>
       <w:r>
-        <w:t xml:space="preserve"> Claude Code (Anthropic) wrote the map UI code, ran the checks in the table above and drafted my report sections and this report (AI_USAGE.md entry 10). The UI decisions it followed (token kept in the browser, error messages shown as returned, map refreshed after each action) are the ones I set in my PR #8 review before any UI code existed. The checks were run by the AI on my machine and are recorded with screenshots; a re-run by a team member is still to do.</w:t>
+        <w:t xml:space="preserve"> Claude Code (Anthropic) wrote the map UI code, ran the checks above on my machine and drafted my report sections and this report (AI_USAGE.md entry 10). It followed the UI decisions from my PR #8 review (token in the browser, messages shown as returned, refresh after each action). A re-run of the checks by a team member is still to do.</w:t>
       </w:r>
     </w:p>
     <w:p>
@@ -750,7 +700,7 @@
     </w:p>
     <w:p>
       <w:r>
-        <w:t>Add automatic refresh of the map (Week 9), run the mockup user test P1 with Esteve (Week 9), and show S1 and S2 on the real cafeteria layout at the MVP demo M4 (Week 10). If P1 supports it, build the UI of "open to company" (S3) with the privacy rules of section 6 of the team report.</w:t>
+        <w:t>Automatic map refresh and the P1 user test with Esteve (Week 9), then S1 and S2 on the real layout at the MVP demo M4 (Week 10); the "open to company" UI only if P1 supports it.</w:t>
       </w:r>
     </w:p>
     <w:sectPr>

</xml_diff>